<commit_message>
Fix authorization template date fields
</commit_message>
<xml_diff>
--- a/assets/templates/word/business_registration/4. Giấy ủy quyền.docx
+++ b/assets/templates/word/business_registration/4. Giấy ủy quyền.docx
@@ -98,7 +98,7 @@
       </w:pPr>
       <w:bookmarkStart w:id="31000" w:name="MINGO_FIELD_0"/>
       <w:r>
-        <w:t xml:space="preserve">Tây Ninh, ngày 23 tháng 03 năm 2026</w:t>
+        <w:t xml:space="preserve"> </w:t>
       </w:r>
       <w:bookmarkEnd w:id="31000"/>
     </w:p>
@@ -162,7 +162,6 @@
           <w:color w:val="000000"/>
           <w:sz w:val="25"/>
           <w:szCs w:val="25"/>
-          <w:highlight w:val="yellow"/>
           <w:lang w:eastAsia="zh-CN"/>
         </w:rPr>
       </w:pPr>
@@ -171,7 +170,7 @@
       </w:r>
       <w:bookmarkStart w:id="31001" w:name="MINGO_FIELD_1"/>
       <w:r>
-        <w:t xml:space="preserve">THOMAS EDITION</w:t>
+        <w:t xml:space="preserve"> </w:t>
       </w:r>
       <w:bookmarkEnd w:id="31001"/>
     </w:p>
@@ -187,7 +186,6 @@
         <w:rPr>
           <w:sz w:val="25"/>
           <w:szCs w:val="25"/>
-          <w:highlight w:val="yellow"/>
         </w:rPr>
       </w:pPr>
       <w:r>
@@ -195,7 +193,7 @@
       </w:r>
       <w:bookmarkStart w:id="31002" w:name="MINGO_FIELD_2"/>
       <w:r>
-        <w:t xml:space="preserve">11/11/1111</w:t>
+        <w:t xml:space="preserve"> </w:t>
       </w:r>
       <w:bookmarkEnd w:id="31002"/>
     </w:p>
@@ -211,7 +209,6 @@
         <w:rPr>
           <w:sz w:val="25"/>
           <w:szCs w:val="25"/>
-          <w:highlight w:val="yellow"/>
         </w:rPr>
       </w:pPr>
       <w:r>
@@ -219,7 +216,7 @@
       </w:r>
       <w:bookmarkStart w:id="31003" w:name="MINGO_FIELD_3"/>
       <w:r>
-        <w:t xml:space="preserve">Nữ</w:t>
+        <w:t xml:space="preserve"> </w:t>
       </w:r>
       <w:bookmarkEnd w:id="31003"/>
     </w:p>
@@ -236,7 +233,6 @@
           <w:color w:val="000000"/>
           <w:sz w:val="25"/>
           <w:szCs w:val="25"/>
-          <w:highlight w:val="yellow"/>
           <w:lang w:val="pt-BR" w:eastAsia="zh-CN"/>
         </w:rPr>
       </w:pPr>
@@ -245,7 +241,7 @@
       </w:r>
       <w:bookmarkStart w:id="31004" w:name="MINGO_FIELD_4"/>
       <w:r>
-        <w:t xml:space="preserve">0987654321</w:t>
+        <w:t xml:space="preserve"> </w:t>
       </w:r>
       <w:bookmarkEnd w:id="31004"/>
     </w:p>
@@ -261,7 +257,6 @@
         <w:rPr>
           <w:sz w:val="25"/>
           <w:szCs w:val="25"/>
-          <w:highlight w:val="yellow"/>
           <w:lang w:val="pt-BR"/>
         </w:rPr>
       </w:pPr>
@@ -270,7 +265,7 @@
       </w:r>
       <w:bookmarkStart w:id="31005" w:name="MINGO_FIELD_5"/>
       <w:r>
-        <w:t xml:space="preserve">Ấp Hậu Quới, Hậu Mỹ, Đồng Tháp</w:t>
+        <w:t xml:space="preserve"> </w:t>
       </w:r>
       <w:bookmarkEnd w:id="31005"/>
     </w:p>
@@ -304,19 +299,7 @@
         </w:rPr>
         <w:t xml:space="preserve">Là người đại diện theo pháp luật của </w:t>
       </w:r>
-      <w:r>
-        <w:rPr>
-          <w:rFonts w:eastAsia="Times New Roman"/>
-          <w:b/>
-          <w:bCs/>
-          <w:color w:val="000000"/>
-          <w:sz w:val="26"/>
-          <w:szCs w:val="26"/>
-          <w:highlight w:val="yellow"/>
-          <w:lang w:val="vi-VN" w:eastAsia="zh-CN"/>
-        </w:rPr>
-        <w:t>CÔNG</w:t>
-      </w:r>
+      <w:bookmarkStart w:id="31016" w:name="MINGO_FIELD_16"/>
       <w:r>
         <w:rPr>
           <w:rFonts w:eastAsia="Times New Roman"/>
@@ -337,10 +320,9 @@
           <w:color w:val="000000"/>
           <w:sz w:val="26"/>
           <w:szCs w:val="26"/>
-          <w:highlight w:val="yellow"/>
           <w:lang w:val="vi-VN" w:eastAsia="zh-CN"/>
         </w:rPr>
-        <w:t>TY</w:t>
+        <w:t xml:space="preserve"/>
       </w:r>
       <w:r>
         <w:rPr>
@@ -352,20 +334,7 @@
           <w:szCs w:val="26"/>
           <w:lang w:val="vi-VN" w:eastAsia="zh-CN"/>
         </w:rPr>
-        <w:t xml:space="preserve"> </w:t>
-      </w:r>
-      <w:r>
-        <w:rPr>
-          <w:rFonts w:eastAsia="Times New Roman"/>
-          <w:b/>
-          <w:bCs/>
-          <w:color w:val="000000"/>
-          <w:sz w:val="26"/>
-          <w:szCs w:val="26"/>
-          <w:highlight w:val="yellow"/>
-          <w:lang w:val="vi-VN" w:eastAsia="zh-CN"/>
-        </w:rPr>
-        <w:t>TNHH</w:t>
+        <w:t/>
       </w:r>
       <w:r>
         <w:rPr>
@@ -377,20 +346,7 @@
           <w:szCs w:val="26"/>
           <w:lang w:val="vi-VN" w:eastAsia="zh-CN"/>
         </w:rPr>
-        <w:t xml:space="preserve"> </w:t>
-      </w:r>
-      <w:r>
-        <w:rPr>
-          <w:rFonts w:eastAsia="Times New Roman"/>
-          <w:b/>
-          <w:bCs/>
-          <w:color w:val="000000"/>
-          <w:sz w:val="26"/>
-          <w:szCs w:val="26"/>
-          <w:highlight w:val="yellow"/>
-          <w:lang w:val="vi-VN" w:eastAsia="zh-CN"/>
-        </w:rPr>
-        <w:t>THƯƠNG</w:t>
+        <w:t xml:space="preserve"/>
       </w:r>
       <w:r>
         <w:rPr>
@@ -402,20 +358,7 @@
           <w:szCs w:val="26"/>
           <w:lang w:val="vi-VN" w:eastAsia="zh-CN"/>
         </w:rPr>
-        <w:t xml:space="preserve"> </w:t>
-      </w:r>
-      <w:r>
-        <w:rPr>
-          <w:rFonts w:eastAsia="Times New Roman"/>
-          <w:b/>
-          <w:bCs/>
-          <w:color w:val="000000"/>
-          <w:sz w:val="26"/>
-          <w:szCs w:val="26"/>
-          <w:highlight w:val="yellow"/>
-          <w:lang w:val="vi-VN" w:eastAsia="zh-CN"/>
-        </w:rPr>
-        <w:t>MẠI</w:t>
+        <w:t/>
       </w:r>
       <w:r>
         <w:rPr>
@@ -427,20 +370,7 @@
           <w:szCs w:val="26"/>
           <w:lang w:val="vi-VN" w:eastAsia="zh-CN"/>
         </w:rPr>
-        <w:t xml:space="preserve"> </w:t>
-      </w:r>
-      <w:r>
-        <w:rPr>
-          <w:rFonts w:eastAsia="Times New Roman"/>
-          <w:b/>
-          <w:bCs/>
-          <w:color w:val="000000"/>
-          <w:sz w:val="26"/>
-          <w:szCs w:val="26"/>
-          <w:highlight w:val="yellow"/>
-          <w:lang w:val="vi-VN" w:eastAsia="zh-CN"/>
-        </w:rPr>
-        <w:t>VÀ</w:t>
+        <w:t xml:space="preserve"/>
       </w:r>
       <w:r>
         <w:rPr>
@@ -452,20 +382,7 @@
           <w:szCs w:val="26"/>
           <w:lang w:val="vi-VN" w:eastAsia="zh-CN"/>
         </w:rPr>
-        <w:t xml:space="preserve"> </w:t>
-      </w:r>
-      <w:r>
-        <w:rPr>
-          <w:rFonts w:eastAsia="Times New Roman"/>
-          <w:b/>
-          <w:bCs/>
-          <w:color w:val="000000"/>
-          <w:sz w:val="26"/>
-          <w:szCs w:val="26"/>
-          <w:highlight w:val="yellow"/>
-          <w:lang w:val="vi-VN" w:eastAsia="zh-CN"/>
-        </w:rPr>
-        <w:t>DỊCH</w:t>
+        <w:t/>
       </w:r>
       <w:r>
         <w:rPr>
@@ -477,20 +394,7 @@
           <w:szCs w:val="26"/>
           <w:lang w:val="vi-VN" w:eastAsia="zh-CN"/>
         </w:rPr>
-        <w:t xml:space="preserve"> </w:t>
-      </w:r>
-      <w:r>
-        <w:rPr>
-          <w:rFonts w:eastAsia="Times New Roman"/>
-          <w:b/>
-          <w:bCs/>
-          <w:color w:val="000000"/>
-          <w:sz w:val="26"/>
-          <w:szCs w:val="26"/>
-          <w:highlight w:val="yellow"/>
-          <w:lang w:val="vi-VN" w:eastAsia="zh-CN"/>
-        </w:rPr>
-        <w:t>VỤ</w:t>
+        <w:t xml:space="preserve"/>
       </w:r>
       <w:r>
         <w:rPr>
@@ -502,7 +406,91 @@
           <w:szCs w:val="26"/>
           <w:lang w:val="vi-VN" w:eastAsia="zh-CN"/>
         </w:rPr>
-        <w:t xml:space="preserve"> </w:t>
+        <w:t/>
+      </w:r>
+      <w:r>
+        <w:rPr>
+          <w:rFonts w:eastAsia="Times New Roman"/>
+          <w:b/>
+          <w:bCs/>
+          <w:color w:val="000000"/>
+          <w:sz w:val="26"/>
+          <w:szCs w:val="26"/>
+          <w:lang w:val="vi-VN" w:eastAsia="zh-CN"/>
+        </w:rPr>
+        <w:t xml:space="preserve"/>
+      </w:r>
+      <w:r>
+        <w:rPr>
+          <w:rFonts w:eastAsia="Times New Roman"/>
+          <w:b/>
+          <w:bCs/>
+          <w:color w:val="000000"/>
+          <w:sz w:val="26"/>
+          <w:szCs w:val="26"/>
+          <w:lang w:val="vi-VN" w:eastAsia="zh-CN"/>
+        </w:rPr>
+        <w:t/>
+      </w:r>
+      <w:r>
+        <w:rPr>
+          <w:rFonts w:eastAsia="Times New Roman"/>
+          <w:b/>
+          <w:bCs/>
+          <w:color w:val="000000"/>
+          <w:sz w:val="26"/>
+          <w:szCs w:val="26"/>
+          <w:lang w:val="vi-VN" w:eastAsia="zh-CN"/>
+        </w:rPr>
+        <w:t xml:space="preserve"/>
+      </w:r>
+      <w:r>
+        <w:rPr>
+          <w:rFonts w:eastAsia="Times New Roman"/>
+          <w:b/>
+          <w:bCs/>
+          <w:color w:val="000000"/>
+          <w:sz w:val="26"/>
+          <w:szCs w:val="26"/>
+          <w:lang w:val="vi-VN" w:eastAsia="zh-CN"/>
+        </w:rPr>
+        <w:t/>
+      </w:r>
+      <w:r>
+        <w:rPr>
+          <w:rFonts w:eastAsia="Times New Roman"/>
+          <w:b/>
+          <w:bCs/>
+          <w:color w:val="000000"/>
+          <w:sz w:val="26"/>
+          <w:szCs w:val="26"/>
+          <w:lang w:val="vi-VN" w:eastAsia="zh-CN"/>
+        </w:rPr>
+        <w:t xml:space="preserve"/>
+      </w:r>
+      <w:r>
+        <w:rPr>
+          <w:rFonts w:eastAsia="Times New Roman"/>
+          <w:b/>
+          <w:bCs/>
+          <w:color w:val="000000"/>
+          <w:sz w:val="26"/>
+          <w:szCs w:val="26"/>
+          <w:lang w:val="vi-VN" w:eastAsia="zh-CN"/>
+        </w:rPr>
+        <w:t/>
+      </w:r>
+      <w:r>
+        <w:rPr>
+          <w:rFonts w:eastAsia="Times New Roman"/>
+          <w:b/>
+          <w:bCs/>
+          <w:color w:val="000000"/>
+          <w:sz w:val="26"/>
+          <w:szCs w:val="26"/>
+          <w:lang w:val="vi-VN" w:eastAsia="zh-CN"/>
+        </w:rPr>
+        <w:t xml:space="preserve"/>
       </w:r>
       <w:r>
         <w:rPr>
@@ -514,8 +502,9 @@
           <w:szCs w:val="26"/>
           <w:lang w:val="pt-BR" w:eastAsia="zh-CN"/>
         </w:rPr>
-        <w:t>EDTION</w:t>
-      </w:r>
+        <w:t/>
+      </w:r>
+      <w:bookmarkEnd w:id="31016"/>
     </w:p>
     <w:p>
       <w:pPr>
@@ -574,7 +563,7 @@
       </w:r>
       <w:bookmarkStart w:id="31006" w:name="MINGO_FIELD_6"/>
       <w:r>
-        <w:t xml:space="preserve">NGUYEN THI KHANH HAHA</w:t>
+        <w:t xml:space="preserve"> </w:t>
       </w:r>
       <w:bookmarkEnd w:id="31006"/>
     </w:p>
@@ -593,7 +582,7 @@
       </w:r>
       <w:bookmarkStart w:id="31007" w:name="MINGO_FIELD_7"/>
       <w:r>
-        <w:t xml:space="preserve">22/12/1111</w:t>
+        <w:t xml:space="preserve"> </w:t>
       </w:r>
       <w:bookmarkEnd w:id="31007"/>
     </w:p>
@@ -612,7 +601,7 @@
       </w:r>
       <w:bookmarkStart w:id="31008" w:name="MINGO_FIELD_8"/>
       <w:r>
-        <w:t xml:space="preserve">Nữ</w:t>
+        <w:t xml:space="preserve"> </w:t>
       </w:r>
       <w:bookmarkEnd w:id="31008"/>
     </w:p>
@@ -631,7 +620,7 @@
       </w:r>
       <w:bookmarkStart w:id="31009" w:name="MINGO_FIELD_9"/>
       <w:r>
-        <w:t xml:space="preserve">098765434567</w:t>
+        <w:t xml:space="preserve"> </w:t>
       </w:r>
       <w:bookmarkEnd w:id="31009"/>
     </w:p>
@@ -650,7 +639,7 @@
       </w:r>
       <w:bookmarkStart w:id="31010" w:name="MINGO_FIELD_10"/>
       <w:r>
-        <w:t xml:space="preserve">Thôn Lầm, Xã Hai Ba, Tỉnh Bốn Năm</w:t>
+        <w:t xml:space="preserve"> </w:t>
       </w:r>
       <w:bookmarkEnd w:id="31010"/>
       <w:r>
@@ -672,7 +661,7 @@
       </w:r>
       <w:bookmarkStart w:id="31011" w:name="MINGO_FIELD_11"/>
       <w:r>
-        <w:t xml:space="preserve">09876545678</w:t>
+        <w:t xml:space="preserve"> </w:t>
       </w:r>
       <w:bookmarkEnd w:id="31011"/>
       <w:r>
@@ -680,7 +669,7 @@
       </w:r>
       <w:bookmarkStart w:id="31012" w:name="MINGO_FIELD_12"/>
       <w:r>
-        <w:t xml:space="preserve">fsgdhfjg@gmail.com</w:t>
+        <w:t xml:space="preserve"> </w:t>
       </w:r>
       <w:bookmarkEnd w:id="31012"/>
     </w:p>
@@ -722,7 +711,7 @@
       </w:r>
       <w:bookmarkStart w:id="31013" w:name="MINGO_FIELD_13"/>
       <w:r>
-        <w:t xml:space="preserve">Phòng Đăng ký kinh doanh tỉnh Tây Ninh</w:t>
+        <w:t xml:space="preserve"> </w:t>
       </w:r>
       <w:bookmarkEnd w:id="31013"/>
       <w:r>
@@ -787,7 +776,7 @@
       </w:r>
       <w:bookmarkStart w:id="31014" w:name="MINGO_FIELD_14"/>
       <w:r>
-        <w:t xml:space="preserve">Phòng Đăng ký kinh doanh tỉnh Tây Ninh</w:t>
+        <w:t xml:space="preserve"> </w:t>
       </w:r>
       <w:bookmarkEnd w:id="31014"/>
       <w:r>
@@ -814,7 +803,7 @@
       </w:r>
       <w:bookmarkStart w:id="31015" w:name="MINGO_FIELD_15"/>
       <w:r>
-        <w:t xml:space="preserve">Phòng Đăng ký kinh doanh tỉnh Tây Ninh </w:t>
+        <w:t xml:space="preserve"> </w:t>
       </w:r>
       <w:bookmarkEnd w:id="31015"/>
       <w:r>
@@ -1092,15 +1081,15 @@
                 <w:lang w:val="vi-VN"/>
               </w:rPr>
             </w:pPr>
+            <w:bookmarkStart w:id="31017" w:name="MINGO_FIELD_17"/>
             <w:r>
               <w:rPr>
                 <w:b/>
                 <w:bCs/>
                 <w:sz w:val="25"/>
                 <w:szCs w:val="25"/>
-                <w:highlight w:val="yellow"/>
               </w:rPr>
-              <w:t>THOMAS</w:t>
+              <w:t xml:space="preserve"> </w:t>
             </w:r>
             <w:r>
               <w:rPr>
@@ -1110,7 +1099,7 @@
                 <w:szCs w:val="25"/>
                 <w:lang w:val="vi-VN"/>
               </w:rPr>
-              <w:t xml:space="preserve"> </w:t>
+              <w:t xml:space="preserve"/>
             </w:r>
             <w:r>
               <w:rPr>
@@ -1118,11 +1107,11 @@
                 <w:bCs/>
                 <w:sz w:val="25"/>
                 <w:szCs w:val="25"/>
-                <w:highlight w:val="yellow"/>
                 <w:lang w:val="vi-VN"/>
               </w:rPr>
-              <w:t>EDITION</w:t>
+              <w:t/>
             </w:r>
+            <w:bookmarkEnd w:id="31017"/>
           </w:p>
         </w:tc>
       </w:tr>

</xml_diff>